<commit_message>
Incorporate Final_v2 findings into draft guide and Word doc
- 안용한·김영호(2023), 이희연·이다예·유재성(2015) 인용 확정
- 서론 갭: "집중 ≠ 분리" 문장 추가
- 결과 4.1: 이희연(2015) 중계2·3동·월계2동 일치 연결
- 결과 4.2, 4.3: D < 0.30 관례적 기준 추가
- 결과 4.4: bandwidth별 D 표(Table 2) + NSI 표(Table 3) 실수치 추가
- 결론 한계: 생태학적 오류, 등록-실거주 불일치 추가 (3→4가지)

Co-Authored-By: Claude Sonnet 4.6 <noreply@anthropic.com>
</commit_message>
<xml_diff>
--- a/RSG_final/논문_초안_v1.docx
+++ b/RSG_final/논문_초안_v1.docx
@@ -157,7 +157,7 @@
           <w:i w:val="0"/>
           <w:sz w:val="22"/>
         </w:rPr>
-        <w:t>저소득 독거노인의 공간적 분포에 관한 기존 연구는 크게 두 방향으로 진행되어 왔다. 첫째는 특정 집단이 어디에 집중되는지를 파악하는 공간 군집 분석으로, 노인 밀집 지역이나 고독사 위험 지역의 식별에 초점을 맞추어 왔다(⚠️ Ahn 2023; Lee 2011). 둘째는 해당 분포에 영향을 미치는 요인을 규명하는 회귀 기반 접근으로, 주거비, 교통 접근성 등의 변수와 노인 집중도의 관계를 분석하였다. 한편 거주지 분리의 측정 체계는 Massey &amp; Denton(1988)의 5차원 분류에서 출발하여, Reardon &amp; O'Sullivan(2004)이 균등성(evenness)과 노출(exposure)의 두 축으로 압축·정립하였으며, Feitosa(2007)는 이를 가우시안 커널 기반의 공간 가중 측도로 확장하여 행정 경계 의존성을 완화하였다.</w:t>
+        <w:t>저소득 독거노인의 공간적 분포에 관한 기존 연구는 크게 두 방향으로 진행되어 왔다. 첫째는 특정 집단이 어디에 집중되는지를 파악하는 공간 군집 분석으로, 노인 밀집 지역이나 고독사 위험 지역의 식별에 초점을 맞추어 왔다(이희연·이다예·유재성 2015; 안용한·김영호 2023). 둘째는 해당 분포에 영향을 미치는 요인을 규명하는 회귀 기반 접근으로, 주거비, 교통 접근성 등의 변수와 노인 집중도의 관계를 분석하였다. 한편 거주지 분리의 측정 체계는 Massey &amp; Denton(1988)의 5차원 분류에서 출발하여, Reardon &amp; O'Sullivan(2004)이 균등성(evenness)과 노출(exposure)의 두 축으로 압축·정립하였으며, Feitosa(2007)는 이를 가우시안 커널 기반의 공간 가중 측도로 확장하여 행정 경계 의존성을 완화하였다.</w:t>
       </w:r>
     </w:p>
     <w:p>
@@ -173,7 +173,7 @@
           <w:i w:val="0"/>
           <w:sz w:val="22"/>
         </w:rPr>
-        <w:t>그러나 기존 연구들은 두 가지 중요한 갭을 남긴다. 첫째, 국내 독거노인 연구는 분포의 군집 여부나 영향 요인 분석에 집중할 뿐, 집단 간 공간적 분리의 정도 자체를 정량적으로 측정하지 않았다. 특정 지역에 누가 얼마나 사는지는 알아도, 저소득 독거노인이 나머지 인구로부터 얼마나, 어떤 방식으로 분리되어 있는지는 측정된 바 없다. 둘째, 거주지 분리 측도를 적용한 연구들은 대부분 인종·민족 분리 맥락에 한정되어 있으며, 노출 축(고립지수)으로 저소득 독거노인의 사회적 고립 정도를 측정한 연구와, 균등성 축(상이지수)으로 독거노인 집단 내 소득 기반 분리를 측정한 연구는 국내외를 통틀어 확인되지 않는다.</w:t>
+        <w:t>그러나 기존 연구들은 두 가지 중요한 갭을 남긴다. 첫째, 국내 독거노인 연구는 분포의 군집 여부나 영향 요인 분석에 집중할 뿐, 집단 간 공간적 분리의 정도 자체를 정량적으로 측정하지 않았다. 특정 지역에 누가 얼마나 사는지는 알아도, 저소득 독거노인이 나머지 인구로부터 얼마나, 어떤 방식으로 분리되어 있는지는 측정된 바 없다. 집중(concentration)과 분리(segregation)는 다른 현상으로, 저소득 독거노인이 특정 동에 많다는 것이 곧 다른 집단과 구조적으로 분리되어 있음을 의미하지 않는다. 둘째, 거주지 분리 측도를 적용한 연구들은 대부분 인종·민족 분리 맥락에 한정되어 있으며, 노출 축(고립지수)으로 저소득 독거노인의 사회적 고립 정도를 측정한 연구와, 균등성 축(상이지수)으로 독거노인 집단 내 소득 기반 분리를 측정한 연구는 국내외를 통틀어 확인되지 않는다.</w:t>
       </w:r>
     </w:p>
     <w:p>
@@ -311,7 +311,7 @@
           <w:i w:val="0"/>
           <w:sz w:val="22"/>
         </w:rPr>
-        <w:t>국내에서는 저소득층의 주거 분포나 영향 요인을 다룬 연구(⚠️ Ahn 2023; Lee 2011)가 존재하나, 독거노인 가구를 소득 집단으로 구분하여 균등성 축의 분리 측도를 적용한 연구는 확인되지 않는다.</w:t>
+        <w:t>국내에서는 이희연·이다예·유재성(2015)이 서울시 저소득층 노인 밀집지구의 시·공간 분포와 근린환경 특성을 분석하여 월계2동·중계2·3동·등촌동 등 임대아파트 지역의 저소득층 노인 밀집을 확인하였으며, 안용한·김영호(2023)는 다층모형으로 저소득 독거노인 분포의 영향 요인을 규명한 바 있다. 그러나 이 연구들은 독거노인 가구를 소득 집단으로 구분하여 균등성 축의 분리 측도를 적용하지 않았다는 점에서 한계가 있다.</w:t>
       </w:r>
     </w:p>
     <w:p>
@@ -1191,7 +1191,7 @@
           <w:i w:val="0"/>
           <w:sz w:val="22"/>
         </w:rPr>
-        <w:t>이 결과는 소득 제약이 거주지 선택을 제한하여 특정 지역으로의 집중을 낳는다는 Reardon &amp; Bischoff(2011)의 메커니즘과 일치하며, 강서·노원 지역의 저렴 주택 집중이 고립 응축의 공간적 기반임을 시사한다.</w:t>
+        <w:t>이 결과는 소득 제약이 거주지 선택을 제한하여 특정 지역으로의 집중을 낳는다는 Reardon &amp; Bischoff(2011)의 메커니즘과 일치하며, 강서·노원 지역의 저렴 주택 집중이 고립 응축의 공간적 기반임을 시사한다. 특히 국지 고립지수 상위권에 포함된 노원구 중계2·3동(3위)·월계2동(5위)은 이희연·이다예·유재성(2015)이 저소득층 노인 밀집지구로 확인한 영구임대아파트 지구와 일치하며, 본 연구의 측도 결과가 기존 밀집지구 연구와 같은 공간적 방향성을 보임을 실증한다.</w:t>
       </w:r>
     </w:p>
     <w:p>
@@ -1221,7 +1221,7 @@
           <w:i w:val="0"/>
           <w:sz w:val="22"/>
         </w:rPr>
-        <w:t>일반인구 대비 전역 상이지수는 D = 0.1318로 나타났다. 이는 독거노인 내부 소득 분리(D = 0.0859, 4.3절)보다 높은 값으로, 독거 여부 자체보다 소득·고령·1인 가구 특성이 복합적으로 결합된 분리가 더 강하게 작동함을 의미한다.</w:t>
+        <w:t>일반인구 대비 전역 상이지수는 D = 0.1318로 나타났다. 관례적 기준(D &lt; 0.30: 낮은 분리, 0.30~0.60: 중간, &gt; 0.60: 높은 분리)으로는 낮은 분리 수준에 해당하지만, 독거노인 내부 소득 분리(D = 0.0859, 4.3절)보다 높은 값으로, 독거 여부 자체보다 소득·고령·1인 가구 특성이 복합적으로 결합된 분리가 더 강하게 작동함을 의미한다.</w:t>
       </w:r>
     </w:p>
     <w:p>
@@ -1317,7 +1317,7 @@
           <w:i w:val="0"/>
           <w:sz w:val="22"/>
         </w:rPr>
-        <w:t>독거노인 내부 소득 기반 전역 상이지수는 D = 0.0859로, H2-1(0.1318)보다 낮게 나타났다. 이는 서울 전역 평균으로는 독거노인 집단 안에서 소득에 따른 추가적 분리 효과가 상대적으로 제한적임을 시사한다.</w:t>
+        <w:t>독거노인 내부 소득 기반 전역 상이지수는 D = 0.0859로, H2-1(0.1318)보다 낮게 나타났다. 관례적 기준(D &lt; 0.30: 낮은 분리)으로는 낮은 분리 수준에 해당하며, 이는 서울 전역 평균으로는 독거노인 집단 안에서 소득에 따른 추가적 분리 효과가 상대적으로 제한적임을 시사한다.</w:t>
       </w:r>
     </w:p>
     <w:p>
@@ -1413,8 +1413,222 @@
           <w:i w:val="0"/>
           <w:sz w:val="22"/>
         </w:rPr>
-        <w:t>Bandwidth를 500m에서 4,500m로 변화시켜도 전역 상이지수는 안정적으로 유지되었으며, 이는 분석 결과가 bandwidth 선택에 강건(robust)함을 나타낸다.</w:t>
+        <w:t>Bandwidth를 500m에서 3,000m까지 변화시키며 전역 상이지수를 반복 계산한 결과, 아래 표와 같이 단조 감소하면서도 안정적인 패턴을 보였다. 이는 분석 결과가 bandwidth 선택에 강건(robust)함을 나타낸다. 주목할 점은 3,000m 수준에서도 D = 0.054로 0에 수렴하지 않는다는 것으로, 서울 전체적으로 일정 수준의 소득 기반 공간 분리가 구조적으로 존재함을 시사한다.</w:t>
       </w:r>
+    </w:p>
+    <w:p>
+      <w:pPr>
+        <w:spacing w:before="120" w:after="60"/>
+        <w:ind w:firstLine="0"/>
+        <w:jc w:val="center"/>
+      </w:pPr>
+      <w:r>
+        <w:rPr>
+          <w:rFonts w:ascii="Palatino Linotype" w:hAnsi="Palatino Linotype"/>
+          <w:b w:val="0"/>
+          <w:i w:val="0"/>
+          <w:sz w:val="18"/>
+        </w:rPr>
+        <w:t>Table 2. Bandwidth별 전역 상이지수 (D, H2-2 기준).</w:t>
+      </w:r>
+    </w:p>
+    <w:tbl>
+      <w:tblPr>
+        <w:tblStyle w:val="TableGrid"/>
+        <w:tblW w:type="auto" w:w="0"/>
+        <w:tblLook w:firstColumn="1" w:firstRow="1" w:lastColumn="0" w:lastRow="0" w:noHBand="0" w:noVBand="1" w:val="04A0"/>
+      </w:tblPr>
+      <w:tblGrid>
+        <w:gridCol w:w="4536"/>
+        <w:gridCol w:w="4536"/>
+      </w:tblGrid>
+      <w:tr>
+        <w:tc>
+          <w:tcPr>
+            <w:tcW w:type="dxa" w:w="4536"/>
+          </w:tcPr>
+          <w:p>
+            <w:r>
+              <w:rPr>
+                <w:rFonts w:ascii="Palatino Linotype" w:hAnsi="Palatino Linotype"/>
+                <w:b/>
+                <w:sz w:val="18"/>
+              </w:rPr>
+              <w:t>Bandwidth</w:t>
+            </w:r>
+          </w:p>
+        </w:tc>
+        <w:tc>
+          <w:tcPr>
+            <w:tcW w:type="dxa" w:w="4536"/>
+          </w:tcPr>
+          <w:p>
+            <w:r>
+              <w:rPr>
+                <w:rFonts w:ascii="Palatino Linotype" w:hAnsi="Palatino Linotype"/>
+                <w:b/>
+                <w:sz w:val="18"/>
+              </w:rPr>
+              <w:t>전역 D</w:t>
+            </w:r>
+          </w:p>
+        </w:tc>
+      </w:tr>
+      <w:tr>
+        <w:tc>
+          <w:tcPr>
+            <w:tcW w:type="dxa" w:w="4536"/>
+          </w:tcPr>
+          <w:p>
+            <w:r>
+              <w:rPr>
+                <w:rFonts w:ascii="Palatino Linotype" w:hAnsi="Palatino Linotype"/>
+                <w:sz w:val="18"/>
+              </w:rPr>
+              <w:t>500 m</w:t>
+            </w:r>
+          </w:p>
+        </w:tc>
+        <w:tc>
+          <w:tcPr>
+            <w:tcW w:type="dxa" w:w="4536"/>
+          </w:tcPr>
+          <w:p>
+            <w:r>
+              <w:rPr>
+                <w:rFonts w:ascii="Palatino Linotype" w:hAnsi="Palatino Linotype"/>
+                <w:sz w:val="18"/>
+              </w:rPr>
+              <w:t>0.1606</w:t>
+            </w:r>
+          </w:p>
+        </w:tc>
+      </w:tr>
+      <w:tr>
+        <w:tc>
+          <w:tcPr>
+            <w:tcW w:type="dxa" w:w="4536"/>
+          </w:tcPr>
+          <w:p>
+            <w:r>
+              <w:rPr>
+                <w:rFonts w:ascii="Palatino Linotype" w:hAnsi="Palatino Linotype"/>
+                <w:sz w:val="18"/>
+              </w:rPr>
+              <w:t>1,000 m</w:t>
+            </w:r>
+          </w:p>
+        </w:tc>
+        <w:tc>
+          <w:tcPr>
+            <w:tcW w:type="dxa" w:w="4536"/>
+          </w:tcPr>
+          <w:p>
+            <w:r>
+              <w:rPr>
+                <w:rFonts w:ascii="Palatino Linotype" w:hAnsi="Palatino Linotype"/>
+                <w:sz w:val="18"/>
+              </w:rPr>
+              <w:t>0.1107</w:t>
+            </w:r>
+          </w:p>
+        </w:tc>
+      </w:tr>
+      <w:tr>
+        <w:tc>
+          <w:tcPr>
+            <w:tcW w:type="dxa" w:w="4536"/>
+          </w:tcPr>
+          <w:p>
+            <w:r>
+              <w:rPr>
+                <w:rFonts w:ascii="Palatino Linotype" w:hAnsi="Palatino Linotype"/>
+                <w:sz w:val="18"/>
+              </w:rPr>
+              <w:t>1,500 m (주 분석값)</w:t>
+            </w:r>
+          </w:p>
+        </w:tc>
+        <w:tc>
+          <w:tcPr>
+            <w:tcW w:type="dxa" w:w="4536"/>
+          </w:tcPr>
+          <w:p>
+            <w:r>
+              <w:rPr>
+                <w:rFonts w:ascii="Palatino Linotype" w:hAnsi="Palatino Linotype"/>
+                <w:sz w:val="18"/>
+              </w:rPr>
+              <w:t>0.0859</w:t>
+            </w:r>
+          </w:p>
+        </w:tc>
+      </w:tr>
+      <w:tr>
+        <w:tc>
+          <w:tcPr>
+            <w:tcW w:type="dxa" w:w="4536"/>
+          </w:tcPr>
+          <w:p>
+            <w:r>
+              <w:rPr>
+                <w:rFonts w:ascii="Palatino Linotype" w:hAnsi="Palatino Linotype"/>
+                <w:sz w:val="18"/>
+              </w:rPr>
+              <w:t>2,000 m</w:t>
+            </w:r>
+          </w:p>
+        </w:tc>
+        <w:tc>
+          <w:tcPr>
+            <w:tcW w:type="dxa" w:w="4536"/>
+          </w:tcPr>
+          <w:p>
+            <w:r>
+              <w:rPr>
+                <w:rFonts w:ascii="Palatino Linotype" w:hAnsi="Palatino Linotype"/>
+                <w:sz w:val="18"/>
+              </w:rPr>
+              <w:t>0.0715</w:t>
+            </w:r>
+          </w:p>
+        </w:tc>
+      </w:tr>
+      <w:tr>
+        <w:tc>
+          <w:tcPr>
+            <w:tcW w:type="dxa" w:w="4536"/>
+          </w:tcPr>
+          <w:p>
+            <w:r>
+              <w:rPr>
+                <w:rFonts w:ascii="Palatino Linotype" w:hAnsi="Palatino Linotype"/>
+                <w:sz w:val="18"/>
+              </w:rPr>
+              <w:t>3,000 m</w:t>
+            </w:r>
+          </w:p>
+        </w:tc>
+        <w:tc>
+          <w:tcPr>
+            <w:tcW w:type="dxa" w:w="4536"/>
+          </w:tcPr>
+          <w:p>
+            <w:r>
+              <w:rPr>
+                <w:rFonts w:ascii="Palatino Linotype" w:hAnsi="Palatino Linotype"/>
+                <w:sz w:val="18"/>
+              </w:rPr>
+              <w:t>0.0540</w:t>
+            </w:r>
+          </w:p>
+        </w:tc>
+      </w:tr>
+    </w:tbl>
+    <w:p>
+      <w:pPr>
+        <w:spacing w:after="80"/>
+      </w:pPr>
     </w:p>
     <w:p>
       <w:pPr>
@@ -1429,8 +1643,352 @@
           <w:i w:val="0"/>
           <w:sz w:val="22"/>
         </w:rPr>
-        <w:t>NSI 분석 결과, 분리는 약 1,500m 근린 스케일에 집중되어 있었다. 이는 자치구 단위의 광역 정책보다 행정동 단위의 미시적 복지 개입이 더 효율적임을 시사한다.</w:t>
+        <w:t>NSI 분석 결과, 비공간 NSI(행정동 경계 기준)는 0.0503이었으나 반경 500m에서 0.0297(59%), 1,500m에서 0.0090(18%), 3,000m에서 0.0035(7%)로 bandwidth가 넓어질수록 단조 감소하였다. 이는 소득 기반 독거노인 분리가 서울 광역 구조의 문제가 아닌 행정동·근린 수준(~1,500m)의 국지적 패턴임을 의미하며, 자치구 단위 광역 정책보다 행정동 단위의 미시적 복지 개입이 더 효율적임을 시사한다.</w:t>
       </w:r>
+    </w:p>
+    <w:p>
+      <w:pPr>
+        <w:spacing w:before="120" w:after="60"/>
+        <w:ind w:firstLine="0"/>
+        <w:jc w:val="center"/>
+      </w:pPr>
+      <w:r>
+        <w:rPr>
+          <w:rFonts w:ascii="Palatino Linotype" w:hAnsi="Palatino Linotype"/>
+          <w:b w:val="0"/>
+          <w:i w:val="0"/>
+          <w:sz w:val="18"/>
+        </w:rPr>
+        <w:t>Table 3. Bandwidth별 NSI 값.</w:t>
+      </w:r>
+    </w:p>
+    <w:tbl>
+      <w:tblPr>
+        <w:tblStyle w:val="TableGrid"/>
+        <w:tblW w:type="auto" w:w="0"/>
+        <w:tblLook w:firstColumn="1" w:firstRow="1" w:lastColumn="0" w:lastRow="0" w:noHBand="0" w:noVBand="1" w:val="04A0"/>
+      </w:tblPr>
+      <w:tblGrid>
+        <w:gridCol w:w="3024"/>
+        <w:gridCol w:w="3024"/>
+        <w:gridCol w:w="3024"/>
+      </w:tblGrid>
+      <w:tr>
+        <w:tc>
+          <w:tcPr>
+            <w:tcW w:type="dxa" w:w="3024"/>
+          </w:tcPr>
+          <w:p>
+            <w:r>
+              <w:rPr>
+                <w:rFonts w:ascii="Palatino Linotype" w:hAnsi="Palatino Linotype"/>
+                <w:b/>
+                <w:sz w:val="18"/>
+              </w:rPr>
+              <w:t>Bandwidth</w:t>
+            </w:r>
+          </w:p>
+        </w:tc>
+        <w:tc>
+          <w:tcPr>
+            <w:tcW w:type="dxa" w:w="3024"/>
+          </w:tcPr>
+          <w:p>
+            <w:r>
+              <w:rPr>
+                <w:rFonts w:ascii="Palatino Linotype" w:hAnsi="Palatino Linotype"/>
+                <w:b/>
+                <w:sz w:val="18"/>
+              </w:rPr>
+              <w:t>NSI</w:t>
+            </w:r>
+          </w:p>
+        </w:tc>
+        <w:tc>
+          <w:tcPr>
+            <w:tcW w:type="dxa" w:w="3024"/>
+          </w:tcPr>
+          <w:p>
+            <w:r>
+              <w:rPr>
+                <w:rFonts w:ascii="Palatino Linotype" w:hAnsi="Palatino Linotype"/>
+                <w:b/>
+                <w:sz w:val="18"/>
+              </w:rPr>
+              <w:t>비공간 대비</w:t>
+            </w:r>
+          </w:p>
+        </w:tc>
+      </w:tr>
+      <w:tr>
+        <w:tc>
+          <w:tcPr>
+            <w:tcW w:type="dxa" w:w="3024"/>
+          </w:tcPr>
+          <w:p>
+            <w:r>
+              <w:rPr>
+                <w:rFonts w:ascii="Palatino Linotype" w:hAnsi="Palatino Linotype"/>
+                <w:sz w:val="18"/>
+              </w:rPr>
+              <w:t>비공간 (행정동 경계)</w:t>
+            </w:r>
+          </w:p>
+        </w:tc>
+        <w:tc>
+          <w:tcPr>
+            <w:tcW w:type="dxa" w:w="3024"/>
+          </w:tcPr>
+          <w:p>
+            <w:r>
+              <w:rPr>
+                <w:rFonts w:ascii="Palatino Linotype" w:hAnsi="Palatino Linotype"/>
+                <w:sz w:val="18"/>
+              </w:rPr>
+              <w:t>0.0503</w:t>
+            </w:r>
+          </w:p>
+        </w:tc>
+        <w:tc>
+          <w:tcPr>
+            <w:tcW w:type="dxa" w:w="3024"/>
+          </w:tcPr>
+          <w:p>
+            <w:r>
+              <w:rPr>
+                <w:rFonts w:ascii="Palatino Linotype" w:hAnsi="Palatino Linotype"/>
+                <w:sz w:val="18"/>
+              </w:rPr>
+              <w:t>100%</w:t>
+            </w:r>
+          </w:p>
+        </w:tc>
+      </w:tr>
+      <w:tr>
+        <w:tc>
+          <w:tcPr>
+            <w:tcW w:type="dxa" w:w="3024"/>
+          </w:tcPr>
+          <w:p>
+            <w:r>
+              <w:rPr>
+                <w:rFonts w:ascii="Palatino Linotype" w:hAnsi="Palatino Linotype"/>
+                <w:sz w:val="18"/>
+              </w:rPr>
+              <w:t>500 m</w:t>
+            </w:r>
+          </w:p>
+        </w:tc>
+        <w:tc>
+          <w:tcPr>
+            <w:tcW w:type="dxa" w:w="3024"/>
+          </w:tcPr>
+          <w:p>
+            <w:r>
+              <w:rPr>
+                <w:rFonts w:ascii="Palatino Linotype" w:hAnsi="Palatino Linotype"/>
+                <w:sz w:val="18"/>
+              </w:rPr>
+              <w:t>0.0297</w:t>
+            </w:r>
+          </w:p>
+        </w:tc>
+        <w:tc>
+          <w:tcPr>
+            <w:tcW w:type="dxa" w:w="3024"/>
+          </w:tcPr>
+          <w:p>
+            <w:r>
+              <w:rPr>
+                <w:rFonts w:ascii="Palatino Linotype" w:hAnsi="Palatino Linotype"/>
+                <w:sz w:val="18"/>
+              </w:rPr>
+              <w:t>59%</w:t>
+            </w:r>
+          </w:p>
+        </w:tc>
+      </w:tr>
+      <w:tr>
+        <w:tc>
+          <w:tcPr>
+            <w:tcW w:type="dxa" w:w="3024"/>
+          </w:tcPr>
+          <w:p>
+            <w:r>
+              <w:rPr>
+                <w:rFonts w:ascii="Palatino Linotype" w:hAnsi="Palatino Linotype"/>
+                <w:sz w:val="18"/>
+              </w:rPr>
+              <w:t>1,000 m</w:t>
+            </w:r>
+          </w:p>
+        </w:tc>
+        <w:tc>
+          <w:tcPr>
+            <w:tcW w:type="dxa" w:w="3024"/>
+          </w:tcPr>
+          <w:p>
+            <w:r>
+              <w:rPr>
+                <w:rFonts w:ascii="Palatino Linotype" w:hAnsi="Palatino Linotype"/>
+                <w:sz w:val="18"/>
+              </w:rPr>
+              <w:t>0.0138</w:t>
+            </w:r>
+          </w:p>
+        </w:tc>
+        <w:tc>
+          <w:tcPr>
+            <w:tcW w:type="dxa" w:w="3024"/>
+          </w:tcPr>
+          <w:p>
+            <w:r>
+              <w:rPr>
+                <w:rFonts w:ascii="Palatino Linotype" w:hAnsi="Palatino Linotype"/>
+                <w:sz w:val="18"/>
+              </w:rPr>
+              <w:t>27%</w:t>
+            </w:r>
+          </w:p>
+        </w:tc>
+      </w:tr>
+      <w:tr>
+        <w:tc>
+          <w:tcPr>
+            <w:tcW w:type="dxa" w:w="3024"/>
+          </w:tcPr>
+          <w:p>
+            <w:r>
+              <w:rPr>
+                <w:rFonts w:ascii="Palatino Linotype" w:hAnsi="Palatino Linotype"/>
+                <w:sz w:val="18"/>
+              </w:rPr>
+              <w:t>1,500 m</w:t>
+            </w:r>
+          </w:p>
+        </w:tc>
+        <w:tc>
+          <w:tcPr>
+            <w:tcW w:type="dxa" w:w="3024"/>
+          </w:tcPr>
+          <w:p>
+            <w:r>
+              <w:rPr>
+                <w:rFonts w:ascii="Palatino Linotype" w:hAnsi="Palatino Linotype"/>
+                <w:sz w:val="18"/>
+              </w:rPr>
+              <w:t>0.0090</w:t>
+            </w:r>
+          </w:p>
+        </w:tc>
+        <w:tc>
+          <w:tcPr>
+            <w:tcW w:type="dxa" w:w="3024"/>
+          </w:tcPr>
+          <w:p>
+            <w:r>
+              <w:rPr>
+                <w:rFonts w:ascii="Palatino Linotype" w:hAnsi="Palatino Linotype"/>
+                <w:sz w:val="18"/>
+              </w:rPr>
+              <w:t>18%</w:t>
+            </w:r>
+          </w:p>
+        </w:tc>
+      </w:tr>
+      <w:tr>
+        <w:tc>
+          <w:tcPr>
+            <w:tcW w:type="dxa" w:w="3024"/>
+          </w:tcPr>
+          <w:p>
+            <w:r>
+              <w:rPr>
+                <w:rFonts w:ascii="Palatino Linotype" w:hAnsi="Palatino Linotype"/>
+                <w:sz w:val="18"/>
+              </w:rPr>
+              <w:t>2,000 m</w:t>
+            </w:r>
+          </w:p>
+        </w:tc>
+        <w:tc>
+          <w:tcPr>
+            <w:tcW w:type="dxa" w:w="3024"/>
+          </w:tcPr>
+          <w:p>
+            <w:r>
+              <w:rPr>
+                <w:rFonts w:ascii="Palatino Linotype" w:hAnsi="Palatino Linotype"/>
+                <w:sz w:val="18"/>
+              </w:rPr>
+              <w:t>0.0064</w:t>
+            </w:r>
+          </w:p>
+        </w:tc>
+        <w:tc>
+          <w:tcPr>
+            <w:tcW w:type="dxa" w:w="3024"/>
+          </w:tcPr>
+          <w:p>
+            <w:r>
+              <w:rPr>
+                <w:rFonts w:ascii="Palatino Linotype" w:hAnsi="Palatino Linotype"/>
+                <w:sz w:val="18"/>
+              </w:rPr>
+              <w:t>13%</w:t>
+            </w:r>
+          </w:p>
+        </w:tc>
+      </w:tr>
+      <w:tr>
+        <w:tc>
+          <w:tcPr>
+            <w:tcW w:type="dxa" w:w="3024"/>
+          </w:tcPr>
+          <w:p>
+            <w:r>
+              <w:rPr>
+                <w:rFonts w:ascii="Palatino Linotype" w:hAnsi="Palatino Linotype"/>
+                <w:sz w:val="18"/>
+              </w:rPr>
+              <w:t>3,000 m</w:t>
+            </w:r>
+          </w:p>
+        </w:tc>
+        <w:tc>
+          <w:tcPr>
+            <w:tcW w:type="dxa" w:w="3024"/>
+          </w:tcPr>
+          <w:p>
+            <w:r>
+              <w:rPr>
+                <w:rFonts w:ascii="Palatino Linotype" w:hAnsi="Palatino Linotype"/>
+                <w:sz w:val="18"/>
+              </w:rPr>
+              <w:t>0.0035</w:t>
+            </w:r>
+          </w:p>
+        </w:tc>
+        <w:tc>
+          <w:tcPr>
+            <w:tcW w:type="dxa" w:w="3024"/>
+          </w:tcPr>
+          <w:p>
+            <w:r>
+              <w:rPr>
+                <w:rFonts w:ascii="Palatino Linotype" w:hAnsi="Palatino Linotype"/>
+                <w:sz w:val="18"/>
+              </w:rPr>
+              <w:t>7%</w:t>
+            </w:r>
+          </w:p>
+        </w:tc>
+      </w:tr>
+    </w:tbl>
+    <w:p>
+      <w:pPr>
+        <w:spacing w:after="80"/>
+      </w:pPr>
     </w:p>
     <w:p>
       <w:pPr>
@@ -1509,7 +2067,7 @@
           <w:i w:val="0"/>
           <w:sz w:val="22"/>
         </w:rPr>
-        <w:t>본 연구는 세 가지 한계를 갖는다. 첫째, 2024년 단일 시점 데이터로 분리의 시계열적 변화를 파악하기 어렵다. 둘째, 기초생활수급자를 저소득 독거노인의 대리 변수로 사용하였으나, 차상위계층 등 수급 기준 외 실질적 빈곤층이 누락될 수 있다. 셋째, 노인여가복지시설의 공급 분포와의 교차 분석은 분리(수요 측) 연구의 범위를 벗어나는 공급 측 문제로 본 연구에서 제외하였다.</w:t>
+        <w:t>본 연구는 네 가지 한계를 갖는다. 첫째, 2024년 단일 시점 데이터로 분리의 시계열적 변화를 파악하기 어렵다. 둘째, 기초생활수급자를 저소득 독거노인의 대리 변수로 사용하였으나, 차상위계층 등 수급 기준 외 실질적 빈곤층이 누락될 수 있으며, 주민등록 기준 데이터 특성상 실제 거주지와 등록지가 불일치하는 경우도 포함될 수 있다. 셋째, 행정동 단위 집계 데이터의 특성상 동 내부 이질성 포착이 불가능하며, 개인 수준의 결론 도출 시 생태학적 오류(ecological fallacy) 위험이 존재한다. 넷째, 노인여가복지시설의 공급 분포와의 교차 분석은 분리(수요 측) 연구의 범위를 벗어나는 공급 측 문제로 본 연구에서 제외하였다.</w:t>
       </w:r>
     </w:p>
     <w:p>

</xml_diff>

<commit_message>
Add [SW] citations from 승원씨 해외선행연구.xlsx to draft guide and Word doc
- 서론 단락 1: Ku(2021), Kim et al.(2021) 추가 — 독거 여성 노인 빈곤율·서비스 접근 차단
- 선행연구 2.2: ⚠️ Cartone et al. → Cartone(2025), de Sousa Filho(2022), Owens(2016) 대체
- 선행연구 2.3: ⚠️ Qin et al. → Qin et al.(2024), Menec(2019) 구체화
- 결과 4.1 단락 4: Menec(2019) 패턴 일치 추가
- 결과 4.3 단락 3: Owens(2016), Cartone(2025) 연결
- ⚠️ 팀원 확인 테이블: [SW] 항목 7건 + 저널명 포함하여 업데이트

Co-Authored-By: Claude Sonnet 4.6 <noreply@anthropic.com>
</commit_message>
<xml_diff>
--- a/RSG_final/논문_초안_v1.docx
+++ b/RSG_final/논문_초안_v1.docx
@@ -141,7 +141,7 @@
           <w:i w:val="0"/>
           <w:sz w:val="22"/>
         </w:rPr>
-        <w:t>한국의 독거노인 가구는 전체 고령자 가구의 36.1%로 가장 높은 비율을 차지하며, 이 중 상당수가 기초생활수급 대상인 저소득 계층이다(⚠️ 통계청/보건복지부). 거주지 정렬(residential sorting) 이론은 소득 수준에 따라 개인·가구가 특정 지역으로 집중하거나 배제되는 현상이 구조적으로 발생함을 설명한다(Tiebout 1956; Reardon &amp; Bischoff 2011). 저소득 독거노인은 낮은 소득(주거비 부담)과 독거(사회적 관계망 부재)라는 이중 제약을 동시에 가지므로, 거주지 정렬 메커니즘이 이 집단에게 특히 강하게 작동할 수 있다. 이러한 분리가 심화될 경우 사회적 교류 기회의 감소와 복지 서비스 접근성 불평등으로 이어지며, 결국 저소득 독거노인의 거주지 분리는 단순한 공간 패턴이 아닌 복지 불평등의 공간적 발현으로 이해될 필요가 있다.</w:t>
+        <w:t>한국의 독거노인 가구는 전체 고령자 가구의 36.1%로 가장 높은 비율을 차지하며, 이 중 상당수가 기초생활수급 대상인 저소득 계층이다(⚠️ 통계청/보건복지부). 특히 독거 여성 노인의 빈곤율은 58.6%에 달하는 것으로 보고되어(Ku 2021 [SW]), 저소득과 독거가 중첩되는 이중 취약 구조가 심각함을 알 수 있다. 거주지 정렬(residential sorting) 이론은 소득 수준에 따라 개인·가구가 특정 지역으로 집중하거나 배제되는 현상이 구조적으로 발생함을 설명한다(Tiebout 1956; Reardon &amp; Bischoff 2011). 저소득 독거노인은 낮은 소득(주거비 부담)과 독거(사회적 관계망 부재)라는 이중 제약을 동시에 가지므로, 거주지 정렬 메커니즘이 이 집단에게 특히 강하게 작동할 수 있다. 이러한 분리가 심화될 경우 사회적 교류 기회의 감소와 복지 서비스 접근성 불평등으로 이어진다는 점은(Kim et al. 2021 [SW]) 이미 지적된 바 있으며, 결국 저소득 독거노인의 거주지 분리는 단순한 공간 패턴이 아닌 복지 불평등의 공간적 발현으로 이해될 필요가 있다.</w:t>
       </w:r>
     </w:p>
     <w:p>
@@ -295,7 +295,7 @@
           <w:i w:val="0"/>
           <w:sz w:val="22"/>
         </w:rPr>
-        <w:t>소득 기반 거주지 분리는 균등성 축의 대표적 연구 대상으로, ⚠️[Cartone et al.] 등이 상이지수를 활용하여 소득 집단 간 공간적 불균등 분포를 실증한 바 있다. 이 연구들은 소득 불평등이 심화될수록 거주지 분리가 강화되는 패턴을 일관되게 확인하였다.</w:t>
+        <w:t>소득 기반 거주지 분리는 균등성 축의 대표적 연구 대상으로, Cartone(2025) [SW]와 de Sousa Filho(2022) [SW] 등이 상이지수를 활용하여 소득 집단 간 공간적 불균등 분포를 실증한 바 있다. 이 연구들은 소득 불평등이 심화될수록 거주지 분리가 강화되는 패턴을 일관되게 확인하였다. 특히 Owens(2016) [SW]는 가구 유형을 통제한 후에도 소득이 거주지 분리의 독립 요인으로 남음을 실증하였다.</w:t>
       </w:r>
     </w:p>
     <w:p>
@@ -341,7 +341,7 @@
           <w:i w:val="0"/>
           <w:sz w:val="22"/>
         </w:rPr>
-        <w:t>노인의 사회적 고립에 관한 연구는 주로 설문 기반의 개인 척도(외로움, 사회적 관계망)에 집중되어 왔으며(⚠️ 관련 문헌 확인 필요), 집단 수준에서 공간적 고립을 측정한 연구는 제한적이다. 공간적 맥락에서의 노출 지수 연구는 인종·민족 분리 문헌에서 주로 발전하였다(⚠️ Qin et al. 확인 필요).</w:t>
+        <w:t>노인의 사회적 고립에 관한 연구는 주로 설문 기반의 개인 척도(외로움, 사회적 관계망)에 집중되어 왔으며(⚠️ 관련 문헌 확인 필요), 집단 수준에서 공간적 고립을 측정한 연구는 제한적이다. 공간적 고립 연구 중 Menec(2019) [SW]는 저소득 노인 비율이 높은 지역에 고립 노인이 집중되는 패턴을 확인하였으며, Qin et al.(2024) [SW]는 공간 노출 지수를 활용하여 노인의 지역사회 고립을 측정한 바 있다.</w:t>
       </w:r>
     </w:p>
     <w:p>
@@ -1191,7 +1191,7 @@
           <w:i w:val="0"/>
           <w:sz w:val="22"/>
         </w:rPr>
-        <w:t>이 결과는 소득 제약이 거주지 선택을 제한하여 특정 지역으로의 집중을 낳는다는 Reardon &amp; Bischoff(2011)의 메커니즘과 일치하며, 강서·노원 지역의 저렴 주택 집중이 고립 응축의 공간적 기반임을 시사한다. 특히 국지 고립지수 상위권에 포함된 노원구 중계2·3동(3위)·월계2동(5위)은 이희연·이다예·유재성(2015)이 저소득층 노인 밀집지구로 확인한 영구임대아파트 지구와 일치하며, 본 연구의 측도 결과가 기존 밀집지구 연구와 같은 공간적 방향성을 보임을 실증한다.</w:t>
+        <w:t>이 결과는 소득 제약이 거주지 선택을 제한하여 특정 지역으로의 집중을 낳는다는 Reardon &amp; Bischoff(2011)의 메커니즘과 일치하며, 강서·노원 지역의 저렴 주택 집중이 고립 응축의 공간적 기반임을 시사한다. 특히 국지 고립지수 상위권에 포함된 노원구 중계2·3동(3위)·월계2동(5위)은 이희연·이다예·유재성(2015)이 저소득층 노인 밀집지구로 확인한 영구임대아파트 지구와 일치하며, 본 연구의 측도 결과가 기존 밀집지구 연구와 같은 공간적 방향성을 보임을 실증한다. 나아가 Menec(2019) [SW]가 제시한 "저소득 노인 비율이 높은 지역에 고립 노인이 집중된다"는 패턴과도 일치하며, 공간적 고립이 저소득 집중 지역에 중첩됨을 재확인한다.</w:t>
       </w:r>
     </w:p>
     <w:p>
@@ -1383,7 +1383,7 @@
           <w:i w:val="0"/>
           <w:sz w:val="22"/>
         </w:rPr>
-        <w:t>소득이 같은 가구 유형(독거노인) 안에서도 거주지를 분화시키는 독립 요인으로 작용한다는 점은 중요한 함의를 갖는다. 이는 독거라는 가구 형태를 통제한 후에도 소득이 거주지 정렬을 설명하는 독립 변수로 남음을 의미하며, 소득 기반 거주지 정렬이 가구 유형의 효과를 초월하여 작동하는 보편적 메커니즘임을 실증한다(⚠️ Cartone et al. 소득 기반 분리 연구와 연결).</w:t>
+        <w:t>소득이 같은 가구 유형(독거노인) 안에서도 거주지를 분화시키는 독립 요인으로 작용한다는 점은 중요한 함의를 갖는다. 이는 독거라는 가구 형태를 통제한 후에도 소득이 거주지 정렬을 설명하는 독립 변수로 남음을 의미하며, Owens(2016) [SW]가 가구 유형 통제 후에도 소득이 분리의 독립 요인으로 남음을 실증한 결과와 일치한다. 소득 기반 거주지 정렬이 가구 유형의 효과를 초월하여 작동하는 보편적 메커니즘임을 본 연구 결과와 Cartone(2025) [SW] 등 선행연구 모두 지지한다.</w:t>
       </w:r>
     </w:p>
     <w:p>

</xml_diff>

<commit_message>
Structural revisions: research questions, table 4, theoretical contribution
- 서론 단락 1 → 현황 통계 / 이론·문제 제기 2개로 분리
- 서론 단락 2: Massey→Feitosa 측도 계보 중복 제거
- 서론 단락 3: "측정된 바 없다" → "검토된 문헌 내에서 발견되지 않는다" (갭 주장 완화)
- 서론 단락 5: 단일 연구 질문 → 연구 질문 1 + 연구 질문 2 (노출 축 / 균등성 축)
- 선행연구 2.3: 갭 주장 동일하게 완화
- 결과 4.1: Local I 상위 10개 행정동 Table 4 추가
- 결과 4.2: H2-1·H2-2 직접 비교 한계 단서 추가
- 결론: 이론적 기여 문단 신규 추가 (측도 확장, 두 지수 독립성, 정책 대상 수치화)

Co-Authored-By: Claude Sonnet 4.6 <noreply@anthropic.com>
</commit_message>
<xml_diff>
--- a/RSG_final/논문_초안_v1.docx
+++ b/RSG_final/논문_초안_v1.docx
@@ -141,7 +141,7 @@
           <w:i w:val="0"/>
           <w:sz w:val="22"/>
         </w:rPr>
-        <w:t>한국의 독거노인 가구는 전체 고령자 가구의 36.1%로 가장 높은 비율을 차지하며, 이 중 상당수가 기초생활수급 대상인 저소득 계층이다(⚠️ 통계청/보건복지부). 특히 독거 여성 노인의 빈곤율은 58.6%에 달하는 것으로 보고되어(Ku 2021 [SW]), 저소득과 독거가 중첩되는 이중 취약 구조가 심각함을 알 수 있다. 거주지 정렬(residential sorting) 이론은 소득 수준에 따라 개인·가구가 특정 지역으로 집중하거나 배제되는 현상이 구조적으로 발생함을 설명한다(Tiebout 1956; Reardon &amp; Bischoff 2011). 저소득 독거노인은 낮은 소득(주거비 부담)과 독거(사회적 관계망 부재)라는 이중 제약을 동시에 가지므로, 거주지 정렬 메커니즘이 이 집단에게 특히 강하게 작동할 수 있다. 이러한 분리가 심화될 경우 사회적 교류 기회의 감소와 복지 서비스 접근성 불평등으로 이어진다는 점은(Kim et al. 2021 [SW]) 이미 지적된 바 있으며, 결국 저소득 독거노인의 거주지 분리는 단순한 공간 패턴이 아닌 복지 불평등의 공간적 발현으로 이해될 필요가 있다.</w:t>
+        <w:t>한국의 독거노인 가구는 전체 고령자 가구의 36.1%로 가장 높은 비율을 차지하며, 이 중 상당수가 기초생활수급 대상인 저소득 계층이다(⚠️ 통계청/보건복지부). 특히 독거 여성 노인의 빈곤율은 58.6%에 달하는 것으로 보고되어(Ku 2021 [SW]), 저소득과 독거가 중첩되는 이중 취약 구조가 얼마나 심각한지를 짐작할 수 있다.</w:t>
       </w:r>
     </w:p>
     <w:p>
@@ -157,7 +157,7 @@
           <w:i w:val="0"/>
           <w:sz w:val="22"/>
         </w:rPr>
-        <w:t>저소득 독거노인의 공간적 분포에 관한 기존 연구는 크게 두 방향으로 진행되어 왔다. 첫째는 특정 집단이 어디에 집중되는지를 파악하는 공간 군집 분석으로, 노인 밀집 지역이나 고독사 위험 지역의 식별에 초점을 맞추어 왔다(이희연·이다예·유재성 2015; 안용한·김영호 2023). 둘째는 해당 분포에 영향을 미치는 요인을 규명하는 회귀 기반 접근으로, 주거비, 교통 접근성 등의 변수와 노인 집중도의 관계를 분석하였다. 한편 거주지 분리의 측정 체계는 Massey &amp; Denton(1988)의 5차원 분류에서 출발하여, Reardon &amp; O'Sullivan(2004)이 균등성(evenness)과 노출(exposure)의 두 축으로 압축·정립하였으며, Feitosa(2007)는 이를 가우시안 커널 기반의 공간 가중 측도로 확장하여 행정 경계 의존성을 완화하였다.</w:t>
+        <w:t>거주지 정렬(residential sorting) 이론은 소득 수준에 따라 개인·가구가 특정 지역으로 집중하거나 배제되는 현상이 구조적으로 발생함을 설명한다(Tiebout 1956; Reardon &amp; Bischoff 2011). 저소득 독거노인은 낮은 소득(주거비 부담)과 독거(사회적 관계망 부재)라는 이중 제약을 동시에 가지므로, 거주지 정렬 메커니즘이 이 집단에게 특히 강하게 작동할 수 있다. 이러한 분리가 심화될 경우 사회적 교류 기회의 감소와 복지 서비스 접근성 불평등으로 이어진다는 점은(Kim et al. 2021 [SW]) 이미 지적된 바 있으며, 결국 저소득 독거노인의 거주지 분리는 단순한 공간 패턴이 아닌 복지 불평등의 공간적 발현으로 이해될 필요가 있다.</w:t>
       </w:r>
     </w:p>
     <w:p>
@@ -173,7 +173,23 @@
           <w:i w:val="0"/>
           <w:sz w:val="22"/>
         </w:rPr>
-        <w:t>그러나 기존 연구들은 두 가지 중요한 갭을 남긴다. 첫째, 국내 독거노인 연구는 분포의 군집 여부나 영향 요인 분석에 집중할 뿐, 집단 간 공간적 분리의 정도 자체를 정량적으로 측정하지 않았다. 특정 지역에 누가 얼마나 사는지는 알아도, 저소득 독거노인이 나머지 인구로부터 얼마나, 어떤 방식으로 분리되어 있는지는 측정된 바 없다. 집중(concentration)과 분리(segregation)는 다른 현상으로, 저소득 독거노인이 특정 동에 많다는 것이 곧 다른 집단과 구조적으로 분리되어 있음을 의미하지 않는다. 둘째, 거주지 분리 측도를 적용한 연구들은 대부분 인종·민족 분리 맥락에 한정되어 있으며, 노출 축(고립지수)으로 저소득 독거노인의 사회적 고립 정도를 측정한 연구와, 균등성 축(상이지수)으로 독거노인 집단 내 소득 기반 분리를 측정한 연구는 국내외를 통틀어 확인되지 않는다.</w:t>
+        <w:t>저소득 독거노인의 공간적 분포에 관한 기존 연구는 크게 두 방향으로 진행되어 왔다. 첫째는 특정 집단이 어디에 집중되는지를 파악하는 공간 군집 분석으로, 노인 밀집 지역이나 고독사 위험 지역의 식별에 초점을 맞추어 왔다(이희연·이다예·유재성 2015; 안용한·김영호 2023). 둘째는 해당 분포에 영향을 미치는 요인을 규명하는 회귀 기반 접근으로, 주거비, 교통 접근성 등의 변수와 노인 집중도의 관계를 분석하였다. 한편 소득 집단 간 공간적 분리를 정량적으로 측정하는 거주지 분리 측도 연구도 별도의 흐름으로 발전해 왔다(2장 검토). 그러나 이 두 흐름은 공통적으로 중요한 공백을 남긴다.</w:t>
+      </w:r>
+    </w:p>
+    <w:p>
+      <w:pPr>
+        <w:spacing w:line="355" w:lineRule="auto" w:after="0"/>
+        <w:ind w:firstLine="432"/>
+        <w:jc w:val="both"/>
+      </w:pPr>
+      <w:r>
+        <w:rPr>
+          <w:rFonts w:ascii="Palatino Linotype" w:hAnsi="Palatino Linotype"/>
+          <w:b w:val="0"/>
+          <w:i w:val="0"/>
+          <w:sz w:val="22"/>
+        </w:rPr>
+        <w:t>두 흐름 모두 중요한 공백을 남긴다. 첫째, 국내 독거노인 연구는 분포의 군집 여부나 영향 요인 분석에 집중할 뿐, 집단 간 공간적 분리의 정도 자체를 정량적으로 측정한 연구는 검토된 문헌 내에서 발견되지 않는다. 집중(concentration)과 분리(segregation)는 다른 현상으로, 저소득 독거노인이 특정 동에 많다는 것이 곧 다른 집단과 구조적으로 분리되어 있음을 의미하지 않는다. 둘째, 거주지 분리 측도를 적용한 연구들은 대부분 인종·민족 분리 맥락에 한정되어 있으며, 노출 축(고립지수)으로 저소득 독거노인의 사회적 고립 정도를 측정하거나, 균등성 축(상이지수)으로 독거노인 집단 내 소득 기반 분리를 측정한 연구는 검토된 문헌 내에서 확인되지 않는다.</w:t>
       </w:r>
     </w:p>
     <w:p>
@@ -205,7 +221,7 @@
           <w:i w:val="0"/>
           <w:sz w:val="22"/>
         </w:rPr>
-        <w:t>이에 본 연구는 서울시 424개 행정동을 분석 단위로, 저소득 독거노인의 소득 기반 거주지 분리를 노출 축(공간 고립지수)과 균등성 축(공간 상이지수)으로 측정하고자 한다. 구체적인 연구 질문은 다음과 같다: "서울시 저소득 독거노인은 사회 전반으로부터 공간적으로 고립되어 있으며, 독거노인 집단 내부에서 소득 수준에 따라 거주지 분리가 존재하는가?" 이하 본 논문은 2장에서 선행연구를 검토하고, 3장에서 분석 방법론을 기술하며, 4장에서 결과 및 논의를 제시하고, 5장에서 결론을 도출한다.</w:t>
+        <w:t>이에 본 연구는 서울시 424개 행정동을 분석 단위로, 저소득 독거노인의 소득 기반 거주지 분리를 노출 축(공간 고립지수)과 균등성 축(공간 상이지수)으로 측정하고자 한다. 구체적인 연구 질문은 다음과 같다. 연구 질문 1: 서울시 저소득 독거노인은 전체 주민 대비 공간적으로 얼마나 고립되어 있으며, 어떤 지역에 집중되는가? 연구 질문 2: 저소득 독거노인의 거주지 분리는 일반인구 및 일반소득 독거노인 대비 어느 정도이며, 공간적으로 어떤 패턴을 보이는가? 이하 본 논문은 2장에서 선행연구를 검토하고, 3장에서 분석 방법론을 기술하며, 4장에서 결과 및 논의를 제시하고, 5장에서 결론을 도출한다.</w:t>
       </w:r>
     </w:p>
     <w:p>
@@ -357,7 +373,7 @@
           <w:i w:val="0"/>
           <w:sz w:val="22"/>
         </w:rPr>
-        <w:t>저소득 독거노인을 관심 집단으로 설정하고, 전체 주민 대비 공간적 고립의 정도를 노출 축(고립지수)으로 측정한 연구는 국내외를 통틀어 확인되지 않는다.</w:t>
+        <w:t>저소득 독거노인을 관심 집단으로 설정하고, 전체 주민 대비 공간적 고립의 정도를 노출 축(고립지수)으로 측정한 연구는 검토된 문헌 내에서 발견되지 않는다.</w:t>
       </w:r>
     </w:p>
     <w:p>
@@ -1164,6 +1180,682 @@
     </w:p>
     <w:p>
       <w:pPr>
+        <w:spacing w:before="120" w:after="60"/>
+        <w:ind w:firstLine="0"/>
+        <w:jc w:val="center"/>
+      </w:pPr>
+      <w:r>
+        <w:rPr>
+          <w:rFonts w:ascii="Palatino Linotype" w:hAnsi="Palatino Linotype"/>
+          <w:b w:val="0"/>
+          <w:i w:val="0"/>
+          <w:sz w:val="18"/>
+        </w:rPr>
+        <w:t>Table 4. 국지 고립지수(Local I) 상위 10개 행정동.</w:t>
+      </w:r>
+    </w:p>
+    <w:tbl>
+      <w:tblPr>
+        <w:tblStyle w:val="TableGrid"/>
+        <w:tblW w:type="auto" w:w="0"/>
+        <w:tblLook w:firstColumn="1" w:firstRow="1" w:lastColumn="0" w:lastRow="0" w:noHBand="0" w:noVBand="1" w:val="04A0"/>
+      </w:tblPr>
+      <w:tblGrid>
+        <w:gridCol w:w="2268"/>
+        <w:gridCol w:w="2268"/>
+        <w:gridCol w:w="2268"/>
+        <w:gridCol w:w="2268"/>
+      </w:tblGrid>
+      <w:tr>
+        <w:tc>
+          <w:tcPr>
+            <w:tcW w:type="dxa" w:w="2268"/>
+          </w:tcPr>
+          <w:p>
+            <w:r>
+              <w:rPr>
+                <w:rFonts w:ascii="Palatino Linotype" w:hAnsi="Palatino Linotype"/>
+                <w:b/>
+                <w:sz w:val="18"/>
+              </w:rPr>
+              <w:t>순위</w:t>
+            </w:r>
+          </w:p>
+        </w:tc>
+        <w:tc>
+          <w:tcPr>
+            <w:tcW w:type="dxa" w:w="2268"/>
+          </w:tcPr>
+          <w:p>
+            <w:r>
+              <w:rPr>
+                <w:rFonts w:ascii="Palatino Linotype" w:hAnsi="Palatino Linotype"/>
+                <w:b/>
+                <w:sz w:val="18"/>
+              </w:rPr>
+              <w:t>구</w:t>
+            </w:r>
+          </w:p>
+        </w:tc>
+        <w:tc>
+          <w:tcPr>
+            <w:tcW w:type="dxa" w:w="2268"/>
+          </w:tcPr>
+          <w:p>
+            <w:r>
+              <w:rPr>
+                <w:rFonts w:ascii="Palatino Linotype" w:hAnsi="Palatino Linotype"/>
+                <w:b/>
+                <w:sz w:val="18"/>
+              </w:rPr>
+              <w:t>동</w:t>
+            </w:r>
+          </w:p>
+        </w:tc>
+        <w:tc>
+          <w:tcPr>
+            <w:tcW w:type="dxa" w:w="2268"/>
+          </w:tcPr>
+          <w:p>
+            <w:r>
+              <w:rPr>
+                <w:rFonts w:ascii="Palatino Linotype" w:hAnsi="Palatino Linotype"/>
+                <w:b/>
+                <w:sz w:val="18"/>
+              </w:rPr>
+              <w:t>Local I</w:t>
+            </w:r>
+          </w:p>
+        </w:tc>
+      </w:tr>
+      <w:tr>
+        <w:tc>
+          <w:tcPr>
+            <w:tcW w:type="dxa" w:w="2268"/>
+          </w:tcPr>
+          <w:p>
+            <w:r>
+              <w:rPr>
+                <w:rFonts w:ascii="Palatino Linotype" w:hAnsi="Palatino Linotype"/>
+                <w:sz w:val="18"/>
+              </w:rPr>
+              <w:t>1</w:t>
+            </w:r>
+          </w:p>
+        </w:tc>
+        <w:tc>
+          <w:tcPr>
+            <w:tcW w:type="dxa" w:w="2268"/>
+          </w:tcPr>
+          <w:p>
+            <w:r>
+              <w:rPr>
+                <w:rFonts w:ascii="Palatino Linotype" w:hAnsi="Palatino Linotype"/>
+                <w:sz w:val="18"/>
+              </w:rPr>
+              <w:t>강서구</w:t>
+            </w:r>
+          </w:p>
+        </w:tc>
+        <w:tc>
+          <w:tcPr>
+            <w:tcW w:type="dxa" w:w="2268"/>
+          </w:tcPr>
+          <w:p>
+            <w:r>
+              <w:rPr>
+                <w:rFonts w:ascii="Palatino Linotype" w:hAnsi="Palatino Linotype"/>
+                <w:sz w:val="18"/>
+              </w:rPr>
+              <w:t>등촌3동</w:t>
+            </w:r>
+          </w:p>
+        </w:tc>
+        <w:tc>
+          <w:tcPr>
+            <w:tcW w:type="dxa" w:w="2268"/>
+          </w:tcPr>
+          <w:p>
+            <w:r>
+              <w:rPr>
+                <w:rFonts w:ascii="Palatino Linotype" w:hAnsi="Palatino Linotype"/>
+                <w:sz w:val="18"/>
+              </w:rPr>
+              <w:t>0.000417</w:t>
+            </w:r>
+          </w:p>
+        </w:tc>
+      </w:tr>
+      <w:tr>
+        <w:tc>
+          <w:tcPr>
+            <w:tcW w:type="dxa" w:w="2268"/>
+          </w:tcPr>
+          <w:p>
+            <w:r>
+              <w:rPr>
+                <w:rFonts w:ascii="Palatino Linotype" w:hAnsi="Palatino Linotype"/>
+                <w:sz w:val="18"/>
+              </w:rPr>
+              <w:t>2</w:t>
+            </w:r>
+          </w:p>
+        </w:tc>
+        <w:tc>
+          <w:tcPr>
+            <w:tcW w:type="dxa" w:w="2268"/>
+          </w:tcPr>
+          <w:p>
+            <w:r>
+              <w:rPr>
+                <w:rFonts w:ascii="Palatino Linotype" w:hAnsi="Palatino Linotype"/>
+                <w:sz w:val="18"/>
+              </w:rPr>
+              <w:t>강서구</w:t>
+            </w:r>
+          </w:p>
+        </w:tc>
+        <w:tc>
+          <w:tcPr>
+            <w:tcW w:type="dxa" w:w="2268"/>
+          </w:tcPr>
+          <w:p>
+            <w:r>
+              <w:rPr>
+                <w:rFonts w:ascii="Palatino Linotype" w:hAnsi="Palatino Linotype"/>
+                <w:sz w:val="18"/>
+              </w:rPr>
+              <w:t>가양2동</w:t>
+            </w:r>
+          </w:p>
+        </w:tc>
+        <w:tc>
+          <w:tcPr>
+            <w:tcW w:type="dxa" w:w="2268"/>
+          </w:tcPr>
+          <w:p>
+            <w:r>
+              <w:rPr>
+                <w:rFonts w:ascii="Palatino Linotype" w:hAnsi="Palatino Linotype"/>
+                <w:sz w:val="18"/>
+              </w:rPr>
+              <w:t>0.000338</w:t>
+            </w:r>
+          </w:p>
+        </w:tc>
+      </w:tr>
+      <w:tr>
+        <w:tc>
+          <w:tcPr>
+            <w:tcW w:type="dxa" w:w="2268"/>
+          </w:tcPr>
+          <w:p>
+            <w:r>
+              <w:rPr>
+                <w:rFonts w:ascii="Palatino Linotype" w:hAnsi="Palatino Linotype"/>
+                <w:sz w:val="18"/>
+              </w:rPr>
+              <w:t>3</w:t>
+            </w:r>
+          </w:p>
+        </w:tc>
+        <w:tc>
+          <w:tcPr>
+            <w:tcW w:type="dxa" w:w="2268"/>
+          </w:tcPr>
+          <w:p>
+            <w:r>
+              <w:rPr>
+                <w:rFonts w:ascii="Palatino Linotype" w:hAnsi="Palatino Linotype"/>
+                <w:sz w:val="18"/>
+              </w:rPr>
+              <w:t>노원구</w:t>
+            </w:r>
+          </w:p>
+        </w:tc>
+        <w:tc>
+          <w:tcPr>
+            <w:tcW w:type="dxa" w:w="2268"/>
+          </w:tcPr>
+          <w:p>
+            <w:r>
+              <w:rPr>
+                <w:rFonts w:ascii="Palatino Linotype" w:hAnsi="Palatino Linotype"/>
+                <w:sz w:val="18"/>
+              </w:rPr>
+              <w:t>중계2·3동</w:t>
+            </w:r>
+          </w:p>
+        </w:tc>
+        <w:tc>
+          <w:tcPr>
+            <w:tcW w:type="dxa" w:w="2268"/>
+          </w:tcPr>
+          <w:p>
+            <w:r>
+              <w:rPr>
+                <w:rFonts w:ascii="Palatino Linotype" w:hAnsi="Palatino Linotype"/>
+                <w:sz w:val="18"/>
+              </w:rPr>
+              <w:t>0.000248</w:t>
+            </w:r>
+          </w:p>
+        </w:tc>
+      </w:tr>
+      <w:tr>
+        <w:tc>
+          <w:tcPr>
+            <w:tcW w:type="dxa" w:w="2268"/>
+          </w:tcPr>
+          <w:p>
+            <w:r>
+              <w:rPr>
+                <w:rFonts w:ascii="Palatino Linotype" w:hAnsi="Palatino Linotype"/>
+                <w:sz w:val="18"/>
+              </w:rPr>
+              <w:t>4</w:t>
+            </w:r>
+          </w:p>
+        </w:tc>
+        <w:tc>
+          <w:tcPr>
+            <w:tcW w:type="dxa" w:w="2268"/>
+          </w:tcPr>
+          <w:p>
+            <w:r>
+              <w:rPr>
+                <w:rFonts w:ascii="Palatino Linotype" w:hAnsi="Palatino Linotype"/>
+                <w:sz w:val="18"/>
+              </w:rPr>
+              <w:t>강남구</w:t>
+            </w:r>
+          </w:p>
+        </w:tc>
+        <w:tc>
+          <w:tcPr>
+            <w:tcW w:type="dxa" w:w="2268"/>
+          </w:tcPr>
+          <w:p>
+            <w:r>
+              <w:rPr>
+                <w:rFonts w:ascii="Palatino Linotype" w:hAnsi="Palatino Linotype"/>
+                <w:sz w:val="18"/>
+              </w:rPr>
+              <w:t>수서동</w:t>
+            </w:r>
+          </w:p>
+        </w:tc>
+        <w:tc>
+          <w:tcPr>
+            <w:tcW w:type="dxa" w:w="2268"/>
+          </w:tcPr>
+          <w:p>
+            <w:r>
+              <w:rPr>
+                <w:rFonts w:ascii="Palatino Linotype" w:hAnsi="Palatino Linotype"/>
+                <w:sz w:val="18"/>
+              </w:rPr>
+              <w:t>0.000202</w:t>
+            </w:r>
+          </w:p>
+        </w:tc>
+      </w:tr>
+      <w:tr>
+        <w:tc>
+          <w:tcPr>
+            <w:tcW w:type="dxa" w:w="2268"/>
+          </w:tcPr>
+          <w:p>
+            <w:r>
+              <w:rPr>
+                <w:rFonts w:ascii="Palatino Linotype" w:hAnsi="Palatino Linotype"/>
+                <w:sz w:val="18"/>
+              </w:rPr>
+              <w:t>5</w:t>
+            </w:r>
+          </w:p>
+        </w:tc>
+        <w:tc>
+          <w:tcPr>
+            <w:tcW w:type="dxa" w:w="2268"/>
+          </w:tcPr>
+          <w:p>
+            <w:r>
+              <w:rPr>
+                <w:rFonts w:ascii="Palatino Linotype" w:hAnsi="Palatino Linotype"/>
+                <w:sz w:val="18"/>
+              </w:rPr>
+              <w:t>노원구</w:t>
+            </w:r>
+          </w:p>
+        </w:tc>
+        <w:tc>
+          <w:tcPr>
+            <w:tcW w:type="dxa" w:w="2268"/>
+          </w:tcPr>
+          <w:p>
+            <w:r>
+              <w:rPr>
+                <w:rFonts w:ascii="Palatino Linotype" w:hAnsi="Palatino Linotype"/>
+                <w:sz w:val="18"/>
+              </w:rPr>
+              <w:t>월계2동</w:t>
+            </w:r>
+          </w:p>
+        </w:tc>
+        <w:tc>
+          <w:tcPr>
+            <w:tcW w:type="dxa" w:w="2268"/>
+          </w:tcPr>
+          <w:p>
+            <w:r>
+              <w:rPr>
+                <w:rFonts w:ascii="Palatino Linotype" w:hAnsi="Palatino Linotype"/>
+                <w:sz w:val="18"/>
+              </w:rPr>
+              <w:t>0.000194</w:t>
+            </w:r>
+          </w:p>
+        </w:tc>
+      </w:tr>
+      <w:tr>
+        <w:tc>
+          <w:tcPr>
+            <w:tcW w:type="dxa" w:w="2268"/>
+          </w:tcPr>
+          <w:p>
+            <w:r>
+              <w:rPr>
+                <w:rFonts w:ascii="Palatino Linotype" w:hAnsi="Palatino Linotype"/>
+                <w:sz w:val="18"/>
+              </w:rPr>
+              <w:t>6</w:t>
+            </w:r>
+          </w:p>
+        </w:tc>
+        <w:tc>
+          <w:tcPr>
+            <w:tcW w:type="dxa" w:w="2268"/>
+          </w:tcPr>
+          <w:p>
+            <w:r>
+              <w:rPr>
+                <w:rFonts w:ascii="Palatino Linotype" w:hAnsi="Palatino Linotype"/>
+                <w:sz w:val="18"/>
+              </w:rPr>
+              <w:t>노원구</w:t>
+            </w:r>
+          </w:p>
+        </w:tc>
+        <w:tc>
+          <w:tcPr>
+            <w:tcW w:type="dxa" w:w="2268"/>
+          </w:tcPr>
+          <w:p>
+            <w:r>
+              <w:rPr>
+                <w:rFonts w:ascii="Palatino Linotype" w:hAnsi="Palatino Linotype"/>
+                <w:sz w:val="18"/>
+              </w:rPr>
+              <w:t>하계1동</w:t>
+            </w:r>
+          </w:p>
+        </w:tc>
+        <w:tc>
+          <w:tcPr>
+            <w:tcW w:type="dxa" w:w="2268"/>
+          </w:tcPr>
+          <w:p>
+            <w:r>
+              <w:rPr>
+                <w:rFonts w:ascii="Palatino Linotype" w:hAnsi="Palatino Linotype"/>
+                <w:sz w:val="18"/>
+              </w:rPr>
+              <w:t>0.000187</w:t>
+            </w:r>
+          </w:p>
+        </w:tc>
+      </w:tr>
+      <w:tr>
+        <w:tc>
+          <w:tcPr>
+            <w:tcW w:type="dxa" w:w="2268"/>
+          </w:tcPr>
+          <w:p>
+            <w:r>
+              <w:rPr>
+                <w:rFonts w:ascii="Palatino Linotype" w:hAnsi="Palatino Linotype"/>
+                <w:sz w:val="18"/>
+              </w:rPr>
+              <w:t>7</w:t>
+            </w:r>
+          </w:p>
+        </w:tc>
+        <w:tc>
+          <w:tcPr>
+            <w:tcW w:type="dxa" w:w="2268"/>
+          </w:tcPr>
+          <w:p>
+            <w:r>
+              <w:rPr>
+                <w:rFonts w:ascii="Palatino Linotype" w:hAnsi="Palatino Linotype"/>
+                <w:sz w:val="18"/>
+              </w:rPr>
+              <w:t>강서구</w:t>
+            </w:r>
+          </w:p>
+        </w:tc>
+        <w:tc>
+          <w:tcPr>
+            <w:tcW w:type="dxa" w:w="2268"/>
+          </w:tcPr>
+          <w:p>
+            <w:r>
+              <w:rPr>
+                <w:rFonts w:ascii="Palatino Linotype" w:hAnsi="Palatino Linotype"/>
+                <w:sz w:val="18"/>
+              </w:rPr>
+              <w:t>방화3동</w:t>
+            </w:r>
+          </w:p>
+        </w:tc>
+        <w:tc>
+          <w:tcPr>
+            <w:tcW w:type="dxa" w:w="2268"/>
+          </w:tcPr>
+          <w:p>
+            <w:r>
+              <w:rPr>
+                <w:rFonts w:ascii="Palatino Linotype" w:hAnsi="Palatino Linotype"/>
+                <w:sz w:val="18"/>
+              </w:rPr>
+              <w:t>0.000185</w:t>
+            </w:r>
+          </w:p>
+        </w:tc>
+      </w:tr>
+      <w:tr>
+        <w:tc>
+          <w:tcPr>
+            <w:tcW w:type="dxa" w:w="2268"/>
+          </w:tcPr>
+          <w:p>
+            <w:r>
+              <w:rPr>
+                <w:rFonts w:ascii="Palatino Linotype" w:hAnsi="Palatino Linotype"/>
+                <w:sz w:val="18"/>
+              </w:rPr>
+              <w:t>8</w:t>
+            </w:r>
+          </w:p>
+        </w:tc>
+        <w:tc>
+          <w:tcPr>
+            <w:tcW w:type="dxa" w:w="2268"/>
+          </w:tcPr>
+          <w:p>
+            <w:r>
+              <w:rPr>
+                <w:rFonts w:ascii="Palatino Linotype" w:hAnsi="Palatino Linotype"/>
+                <w:sz w:val="18"/>
+              </w:rPr>
+              <w:t>중랑구</w:t>
+            </w:r>
+          </w:p>
+        </w:tc>
+        <w:tc>
+          <w:tcPr>
+            <w:tcW w:type="dxa" w:w="2268"/>
+          </w:tcPr>
+          <w:p>
+            <w:r>
+              <w:rPr>
+                <w:rFonts w:ascii="Palatino Linotype" w:hAnsi="Palatino Linotype"/>
+                <w:sz w:val="18"/>
+              </w:rPr>
+              <w:t>망우본동</w:t>
+            </w:r>
+          </w:p>
+        </w:tc>
+        <w:tc>
+          <w:tcPr>
+            <w:tcW w:type="dxa" w:w="2268"/>
+          </w:tcPr>
+          <w:p>
+            <w:r>
+              <w:rPr>
+                <w:rFonts w:ascii="Palatino Linotype" w:hAnsi="Palatino Linotype"/>
+                <w:sz w:val="18"/>
+              </w:rPr>
+              <w:t>0.000178</w:t>
+            </w:r>
+          </w:p>
+        </w:tc>
+      </w:tr>
+      <w:tr>
+        <w:tc>
+          <w:tcPr>
+            <w:tcW w:type="dxa" w:w="2268"/>
+          </w:tcPr>
+          <w:p>
+            <w:r>
+              <w:rPr>
+                <w:rFonts w:ascii="Palatino Linotype" w:hAnsi="Palatino Linotype"/>
+                <w:sz w:val="18"/>
+              </w:rPr>
+              <w:t>9</w:t>
+            </w:r>
+          </w:p>
+        </w:tc>
+        <w:tc>
+          <w:tcPr>
+            <w:tcW w:type="dxa" w:w="2268"/>
+          </w:tcPr>
+          <w:p>
+            <w:r>
+              <w:rPr>
+                <w:rFonts w:ascii="Palatino Linotype" w:hAnsi="Palatino Linotype"/>
+                <w:sz w:val="18"/>
+              </w:rPr>
+              <w:t>노원구</w:t>
+            </w:r>
+          </w:p>
+        </w:tc>
+        <w:tc>
+          <w:tcPr>
+            <w:tcW w:type="dxa" w:w="2268"/>
+          </w:tcPr>
+          <w:p>
+            <w:r>
+              <w:rPr>
+                <w:rFonts w:ascii="Palatino Linotype" w:hAnsi="Palatino Linotype"/>
+                <w:sz w:val="18"/>
+              </w:rPr>
+              <w:t>상계3·4동</w:t>
+            </w:r>
+          </w:p>
+        </w:tc>
+        <w:tc>
+          <w:tcPr>
+            <w:tcW w:type="dxa" w:w="2268"/>
+          </w:tcPr>
+          <w:p>
+            <w:r>
+              <w:rPr>
+                <w:rFonts w:ascii="Palatino Linotype" w:hAnsi="Palatino Linotype"/>
+                <w:sz w:val="18"/>
+              </w:rPr>
+              <w:t>0.000174</w:t>
+            </w:r>
+          </w:p>
+        </w:tc>
+      </w:tr>
+      <w:tr>
+        <w:tc>
+          <w:tcPr>
+            <w:tcW w:type="dxa" w:w="2268"/>
+          </w:tcPr>
+          <w:p>
+            <w:r>
+              <w:rPr>
+                <w:rFonts w:ascii="Palatino Linotype" w:hAnsi="Palatino Linotype"/>
+                <w:sz w:val="18"/>
+              </w:rPr>
+              <w:t>10</w:t>
+            </w:r>
+          </w:p>
+        </w:tc>
+        <w:tc>
+          <w:tcPr>
+            <w:tcW w:type="dxa" w:w="2268"/>
+          </w:tcPr>
+          <w:p>
+            <w:r>
+              <w:rPr>
+                <w:rFonts w:ascii="Palatino Linotype" w:hAnsi="Palatino Linotype"/>
+                <w:sz w:val="18"/>
+              </w:rPr>
+              <w:t>강서구</w:t>
+            </w:r>
+          </w:p>
+        </w:tc>
+        <w:tc>
+          <w:tcPr>
+            <w:tcW w:type="dxa" w:w="2268"/>
+          </w:tcPr>
+          <w:p>
+            <w:r>
+              <w:rPr>
+                <w:rFonts w:ascii="Palatino Linotype" w:hAnsi="Palatino Linotype"/>
+                <w:sz w:val="18"/>
+              </w:rPr>
+              <w:t>가양3동</w:t>
+            </w:r>
+          </w:p>
+        </w:tc>
+        <w:tc>
+          <w:tcPr>
+            <w:tcW w:type="dxa" w:w="2268"/>
+          </w:tcPr>
+          <w:p>
+            <w:r>
+              <w:rPr>
+                <w:rFonts w:ascii="Palatino Linotype" w:hAnsi="Palatino Linotype"/>
+                <w:sz w:val="18"/>
+              </w:rPr>
+              <w:t>0.000164</w:t>
+            </w:r>
+          </w:p>
+        </w:tc>
+      </w:tr>
+    </w:tbl>
+    <w:p>
+      <w:pPr>
+        <w:spacing w:after="80"/>
+      </w:pPr>
+    </w:p>
+    <w:p>
+      <w:pPr>
         <w:spacing w:line="355" w:lineRule="auto" w:after="0"/>
         <w:ind w:firstLine="432"/>
         <w:jc w:val="both"/>
@@ -1221,7 +1913,7 @@
           <w:i w:val="0"/>
           <w:sz w:val="22"/>
         </w:rPr>
-        <w:t>일반인구 대비 전역 상이지수는 D = 0.1318로 나타났다. 관례적 기준(D &lt; 0.30: 낮은 분리, 0.30~0.60: 중간, &gt; 0.60: 높은 분리)으로는 낮은 분리 수준에 해당하지만, 독거노인 내부 소득 분리(D = 0.0859, 4.3절)보다 높은 값으로, 독거 여부 자체보다 소득·고령·1인 가구 특성이 복합적으로 결합된 분리가 더 강하게 작동함을 의미한다.</w:t>
+        <w:t>일반인구 대비 전역 상이지수는 D = 0.1318로 나타났다. 관례적 기준(D &lt; 0.30: 낮은 분리, 0.30~0.60: 중간, &gt; 0.60: 높은 분리)으로는 낮은 분리 수준에 해당한다. 이 값은 독거노인 내부 소득 분리(D = 0.0859, 4.3절)보다 높게 나타나는데, 두 분석의 비교 집단 구성이 상이하므로(전체 주민 vs 동질적인 독거노인 집단) 수치를 직접 비교하는 데에는 한계가 있다. 다만 이 결과는 저소득 독거노인의 공간적 위치가 소득 효과 외에도 고령·1인 가구라는 인구학적 특성과 결합되어 있음을 시사한다.</w:t>
       </w:r>
     </w:p>
     <w:p>
@@ -2067,6 +2759,22 @@
           <w:i w:val="0"/>
           <w:sz w:val="22"/>
         </w:rPr>
+        <w:t>이론적 기여 측면에서, 본 연구는 거주지 분리 측도를 인종·민족 맥락에서 소득·가구 형태 맥락으로 확장 적용하였다는 점에서 의의를 갖는다. Reardon &amp; O'Sullivan(2004)의 두 축 프레임(노출·균등성)이 서울시 저소득 독거노인 집단에서도 유효하게 작동함을 실증하였으며, 특히 강남·서초에서 관찰된 Local I 낮음과 Local D 음수의 공존은 두 지수가 독립적으로 움직이는 분리의 두 차원임을 보여주어, 단일 지수로는 포착할 수 없는 분리 구조를 드러낸다. 정책적으로는 Local I 상위 행정동(강서구 등촌3·가양2동, 노원구 중계2·3동 등)을 복지 자원 배치의 우선 대상으로 수치로 뒷받침함으로써, 행정동 단위 미시적 개입의 근거를 제공한다.</w:t>
+      </w:r>
+    </w:p>
+    <w:p>
+      <w:pPr>
+        <w:spacing w:line="355" w:lineRule="auto" w:after="0"/>
+        <w:ind w:firstLine="432"/>
+        <w:jc w:val="both"/>
+      </w:pPr>
+      <w:r>
+        <w:rPr>
+          <w:rFonts w:ascii="Palatino Linotype" w:hAnsi="Palatino Linotype"/>
+          <w:b w:val="0"/>
+          <w:i w:val="0"/>
+          <w:sz w:val="22"/>
+        </w:rPr>
         <w:t>본 연구는 네 가지 한계를 갖는다. 첫째, 2024년 단일 시점 데이터로 분리의 시계열적 변화를 파악하기 어렵다. 둘째, 기초생활수급자를 저소득 독거노인의 대리 변수로 사용하였으나, 차상위계층 등 수급 기준 외 실질적 빈곤층이 누락될 수 있으며, 주민등록 기준 데이터 특성상 실제 거주지와 등록지가 불일치하는 경우도 포함될 수 있다. 셋째, 행정동 단위 집계 데이터의 특성상 동 내부 이질성 포착이 불가능하며, 개인 수준의 결론 도출 시 생태학적 오류(ecological fallacy) 위험이 존재한다. 넷째, 노인여가복지시설의 공급 분포와의 교차 분석은 분리(수요 측) 연구의 범위를 벗어나는 공급 측 문제로 본 연구에서 제외하였다.</w:t>
       </w:r>
     </w:p>

</xml_diff>

<commit_message>
Fill in verified references: 이희연 등(2015), Feitosa et al.(2007) with DOI
Co-Authored-By: Claude Sonnet 4.6 <noreply@anthropic.com>
</commit_message>
<xml_diff>
--- a/RSG_final/논문_초안_v1.docx
+++ b/RSG_final/논문_초안_v1.docx
@@ -2850,7 +2850,7 @@
           <w:i w:val="0"/>
           <w:sz w:val="22"/>
         </w:rPr>
-        <w:t>⚠️ 이희연·이다예·유재성, 2015, [제목·저널명·권호 확인 필요].</w:t>
+        <w:t>이희연·이다예·유재성, 2015, 저소득층 노인 밀집지구의 시·공간 분포와 근린환경 특성: 서울시를 사례로, 서울도시연구, 16(2), 1-18.</w:t>
       </w:r>
     </w:p>
     <w:p>
@@ -3004,7 +3004,7 @@
           <w:i w:val="0"/>
           <w:sz w:val="22"/>
         </w:rPr>
-        <w:t>, 21(3), 299-323.</w:t>
+        <w:t>, 21(3), 299-323. https://doi.org/10.1080/13658810600911903</w:t>
       </w:r>
     </w:p>
     <w:p>

</xml_diff>

<commit_message>
Fill journal names for [SW] refs from 해외선행연구.xlsx; confirm Owens(2016)
Co-Authored-By: Claude Sonnet 4.6 <noreply@anthropic.com>
</commit_message>
<xml_diff>
--- a/RSG_final/논문_초안_v1.docx
+++ b/RSG_final/논문_초안_v1.docx
@@ -2911,7 +2911,7 @@
           <w:i w:val="0"/>
           <w:sz w:val="22"/>
         </w:rPr>
-        <w:t xml:space="preserve">⚠️ [SW] Cartone, A., 2025, [제목·권호 확인 필요], </w:t>
+        <w:t xml:space="preserve">⚠️ [SW] Cartone, A., 2025, [제목·저자전체·권호·DOI 확인 필요], </w:t>
       </w:r>
       <w:r>
         <w:rPr>
@@ -2942,7 +2942,23 @@
           <w:i w:val="0"/>
           <w:sz w:val="22"/>
         </w:rPr>
-        <w:t>⚠️ [SW] de Sousa Filho, ..., 2022, [제목·저자·권호 확인 필요], SN Social Sciences.</w:t>
+        <w:t xml:space="preserve">⚠️ [SW] de Sousa Filho, ..., 2022, [제목·저자전체·권호·DOI 확인 필요], </w:t>
+      </w:r>
+      <w:r>
+        <w:rPr>
+          <w:rFonts w:ascii="Palatino Linotype" w:hAnsi="Palatino Linotype"/>
+          <w:i/>
+          <w:sz w:val="22"/>
+        </w:rPr>
+        <w:t>SN Social Sciences</w:t>
+      </w:r>
+      <w:r>
+        <w:rPr>
+          <w:rFonts w:ascii="Palatino Linotype" w:hAnsi="Palatino Linotype"/>
+          <w:i w:val="0"/>
+          <w:sz w:val="22"/>
+        </w:rPr>
+        <w:t>.</w:t>
       </w:r>
     </w:p>
     <w:p>
@@ -3019,7 +3035,23 @@
           <w:i w:val="0"/>
           <w:sz w:val="22"/>
         </w:rPr>
-        <w:t>⚠️ [SW] Kim et al., 2021, [저자 전체·제목·저널·권호 확인 필요].</w:t>
+        <w:t xml:space="preserve">⚠️ [SW] Kim, ..., 2021, [저자전체·제목·권호·DOI 확인 필요], </w:t>
+      </w:r>
+      <w:r>
+        <w:rPr>
+          <w:rFonts w:ascii="Palatino Linotype" w:hAnsi="Palatino Linotype"/>
+          <w:i/>
+          <w:sz w:val="22"/>
+        </w:rPr>
+        <w:t>Innovation in Aging</w:t>
+      </w:r>
+      <w:r>
+        <w:rPr>
+          <w:rFonts w:ascii="Palatino Linotype" w:hAnsi="Palatino Linotype"/>
+          <w:i w:val="0"/>
+          <w:sz w:val="22"/>
+        </w:rPr>
+        <w:t>.</w:t>
       </w:r>
     </w:p>
     <w:p>
@@ -3034,7 +3066,23 @@
           <w:i w:val="0"/>
           <w:sz w:val="22"/>
         </w:rPr>
-        <w:t>⚠️ [SW] Ku, ..., 2021, [저자 전체·제목·저널·권호 확인 필요].</w:t>
+        <w:t xml:space="preserve">⚠️ [SW] Ku, ..., 2021, [저자전체·제목·권호·DOI 확인 필요], </w:t>
+      </w:r>
+      <w:r>
+        <w:rPr>
+          <w:rFonts w:ascii="Palatino Linotype" w:hAnsi="Palatino Linotype"/>
+          <w:i/>
+          <w:sz w:val="22"/>
+        </w:rPr>
+        <w:t>Population and Development Review</w:t>
+      </w:r>
+      <w:r>
+        <w:rPr>
+          <w:rFonts w:ascii="Palatino Linotype" w:hAnsi="Palatino Linotype"/>
+          <w:i w:val="0"/>
+          <w:sz w:val="22"/>
+        </w:rPr>
+        <w:t>.</w:t>
       </w:r>
     </w:p>
     <w:p>
@@ -3080,22 +3128,7 @@
           <w:i w:val="0"/>
           <w:sz w:val="22"/>
         </w:rPr>
-        <w:t>⚠️ [SW] Menec, V., 2019, [제목·저널·권호 확인 필요].</w:t>
-      </w:r>
-    </w:p>
-    <w:p>
-      <w:pPr>
-        <w:spacing w:line="355" w:lineRule="auto" w:after="60"/>
-        <w:ind w:left="432" w:hanging="432"/>
-        <w:jc w:val="both"/>
-      </w:pPr>
-      <w:r>
-        <w:rPr>
-          <w:rFonts w:ascii="Palatino Linotype" w:hAnsi="Palatino Linotype"/>
-          <w:i w:val="0"/>
-          <w:sz w:val="22"/>
-        </w:rPr>
-        <w:t xml:space="preserve">⚠️ [SW] Owens, A., 2016, [제목·권호 확인 필요], </w:t>
+        <w:t xml:space="preserve">⚠️ [SW] Menec, V., 2019, [저자전체·제목·권호·DOI 확인 필요], </w:t>
       </w:r>
       <w:r>
         <w:rPr>
@@ -3103,7 +3136,7 @@
           <w:i/>
           <w:sz w:val="22"/>
         </w:rPr>
-        <w:t>American Sociological Review</w:t>
+        <w:t>PLoS ONE</w:t>
       </w:r>
       <w:r>
         <w:rPr>
@@ -3126,7 +3159,54 @@
           <w:i w:val="0"/>
           <w:sz w:val="22"/>
         </w:rPr>
-        <w:t>⚠️ [SW] Qin et al., 2024, [저자 전체·제목·저널·권호 확인 필요].</w:t>
+        <w:t xml:space="preserve">Owens, A., 2016, Inequality in children's contexts: income segregation of households with and without children, </w:t>
+      </w:r>
+      <w:r>
+        <w:rPr>
+          <w:rFonts w:ascii="Palatino Linotype" w:hAnsi="Palatino Linotype"/>
+          <w:i/>
+          <w:sz w:val="22"/>
+        </w:rPr>
+        <w:t>American Sociological Review</w:t>
+      </w:r>
+      <w:r>
+        <w:rPr>
+          <w:rFonts w:ascii="Palatino Linotype" w:hAnsi="Palatino Linotype"/>
+          <w:i w:val="0"/>
+          <w:sz w:val="22"/>
+        </w:rPr>
+        <w:t>, 81(3), 549-574.</w:t>
+      </w:r>
+    </w:p>
+    <w:p>
+      <w:pPr>
+        <w:spacing w:line="355" w:lineRule="auto" w:after="60"/>
+        <w:ind w:left="432" w:hanging="432"/>
+        <w:jc w:val="both"/>
+      </w:pPr>
+      <w:r>
+        <w:rPr>
+          <w:rFonts w:ascii="Palatino Linotype" w:hAnsi="Palatino Linotype"/>
+          <w:i w:val="0"/>
+          <w:sz w:val="22"/>
+        </w:rPr>
+        <w:t xml:space="preserve">⚠️ [SW] Qin, ..., 2024, [저자전체·제목·권호·DOI 확인 필요], </w:t>
+      </w:r>
+      <w:r>
+        <w:rPr>
+          <w:rFonts w:ascii="Palatino Linotype" w:hAnsi="Palatino Linotype"/>
+          <w:i/>
+          <w:sz w:val="22"/>
+        </w:rPr>
+        <w:t>BMC Public Health</w:t>
+      </w:r>
+      <w:r>
+        <w:rPr>
+          <w:rFonts w:ascii="Palatino Linotype" w:hAnsi="Palatino Linotype"/>
+          <w:i w:val="0"/>
+          <w:sz w:val="22"/>
+        </w:rPr>
+        <w:t>.</w:t>
       </w:r>
     </w:p>
     <w:p>

</xml_diff>